<commit_message>
Marcius Melhem: revisão da Parte 1
Co-Authored-By: Claude Opus 5.5 <noreply@anthropic.com>
Claude-Session: https://claude.ai/code/session_01MJjUEEZrxQDEUifKK2vj9g
</commit_message>
<xml_diff>
--- a/roteiros/marcius-melhem/Melhem_Parte1.docx
+++ b/roteiros/marcius-melhem/Melhem_Parte1.docx
@@ -31,7 +31,7 @@
         <w:rPr>
           <w:color w:val="C00000"/>
         </w:rPr>
-        <w:t>Fique até o final, porque você vai descobrir o que aconteceu naquela festa de dois mil e dezessete. E como sete denúncias terminaram, quase seis anos depois, num acordo de oito mil reais.</w:t>
+        <w:t>Fique até o final, porque você vai descobrir o que aconteceu naquela festa de dois mil e dezessete. E como um caso com sete denúncias terminou, quase seis anos depois, num acordo de oito mil reais.</w:t>
       </w:r>
     </w:p>
     <w:p>
@@ -95,7 +95,7 @@
         <w:rPr>
           <w:color w:val="000000"/>
         </w:rPr>
-        <w:t>Era o primeiro sinal de que aquele rapaz da Baixada tinha talento para fazer as pessoas rirem.</w:t>
+        <w:t>Era o primeiro sinal de que aquele rapaz da Baixada tinha talento para o palco.</w:t>
       </w:r>
     </w:p>
     <w:p>
@@ -167,7 +167,7 @@
         <w:rPr>
           <w:color w:val="000000"/>
         </w:rPr>
-        <w:t>O especial deu tão certo que, pouco tempo depois, Os Caras de Pau virou programa fixo nas tardes de domingo.</w:t>
+        <w:t>O especial deu tão certo que Os Caras de Pau virou programa fixo nas tardes de domingo.</w:t>
       </w:r>
     </w:p>
     <w:p>
@@ -175,7 +175,7 @@
         <w:rPr>
           <w:color w:val="000000"/>
         </w:rPr>
-        <w:t>No mesmo ano, Melhem apareceu numa das novelas de maior audiência da década, Caminho das Índias, no papel de Radesh.</w:t>
+        <w:t>Em dois mil e nove, Melhem ainda apareceu numa das novelas de maior audiência da década, Caminho das Índias, no papel de Radesh.</w:t>
       </w:r>
     </w:p>
     <w:p>
@@ -199,7 +199,7 @@
         <w:rPr>
           <w:color w:val="000000"/>
         </w:rPr>
-        <w:t>Era um humor diferente, rápido, que ria da própria televisão. O programa virou referência para uma geração inteira de comediantes.</w:t>
+        <w:t>Era um humor diferente, rápido, que ria da própria televisão. O programa ganhou elogios da crítica e ficou anos no ar.</w:t>
       </w:r>
     </w:p>
     <w:p>
@@ -271,7 +271,7 @@
         <w:rPr>
           <w:color w:val="C00000"/>
         </w:rPr>
-        <w:t>Guarde essa cadeira. Porque, segundo as denúncias que vieram depois, era justamente no meio das conversas sobre roteiro e elenco que algumas coisas começaram a acontecer. Coisas que, durante anos, ninguém teve coragem de levar adiante.</w:t>
+        <w:t>Guarde essa cadeira. Porque, segundo as denúncias que vieram depois, era justamente no meio das conversas sobre roteiro e elenco que algumas coisas começaram a acontecer. Coisas que, durante anos, ficaram guardadas entre quatro paredes.</w:t>
       </w:r>
     </w:p>
     <w:p>
@@ -287,7 +287,7 @@
         <w:rPr>
           <w:color w:val="000000"/>
         </w:rPr>
-        <w:t>O antigo Zorra Total tinha sido reformulado. Ganhou um texto mais moderno, um elenco mais jovem e virou de novo um sucesso nas noites de sábado.</w:t>
+        <w:t>O antigo Zorra Total tinha sido reformulado. Ganhou um texto mais moderno e um elenco mais jovem, e voltou a ser comentado nas noites de sábado.</w:t>
       </w:r>
     </w:p>
     <w:p>

</xml_diff>

<commit_message>
Marcius Melhem: Parte 1
Co-Authored-By: Claude Opus 5.5 <noreply@anthropic.com>
Claude-Session: https://claude.ai/code/session_01MJjUEEZrxQDEUifKK2vj9g
</commit_message>
<xml_diff>
--- a/roteiros/marcius-melhem/Melhem_Parte1.docx
+++ b/roteiros/marcius-melhem/Melhem_Parte1.docx
@@ -7,7 +7,7 @@
         <w:pStyle w:val="Heading1"/>
       </w:pPr>
       <w:r>
-        <w:t>Assim FOI a VIDA de MARCIUS MELHEM: O Escândalo Que A Globo Não Conseguiu Abafar — Parte 1</w:t>
+        <w:t>MARCIUS MELHEM: O Escândalo Que a Globo Nunca Explicou — Parte 1</w:t>
       </w:r>
     </w:p>
     <w:p>
@@ -15,7 +15,7 @@
         <w:rPr>
           <w:color w:val="C00000"/>
         </w:rPr>
-        <w:t>Marcius Melhem passou anos fazendo o Brasil rir e comandando o humor da maior emissora do país. Mas, longe das câmeras, os bastidores do Zorra guardavam uma história sombria que a versão oficial nunca contou.</w:t>
+        <w:t>Marcius Melhem comandava todo o humor da maior emissora do país quando, em agosto de dois mil e vinte, deixou a Globo depois de dezessete anos, sem que a emissora explicasse o verdadeiro motivo.</w:t>
       </w:r>
     </w:p>
     <w:p>
@@ -23,7 +23,7 @@
         <w:rPr>
           <w:color w:val="C00000"/>
         </w:rPr>
-        <w:t>O que pouca gente sabe é que, quando ele saiu da Globo depois de dezessete anos, o anúncio falou apenas num acordo. O que estava por trás só apareceu meses depois, numa reportagem que ouviu quarenta e três pessoas.</w:t>
+        <w:t>O que pouca gente sabe é que, quatro meses depois, uma reportagem trouxe relatos sobre o que teria acontecido nos bastidores daquele departamento. E que, em setembro de dois mil e vinte e seis, essa história terminou de um jeito que deixou o Brasil inteiro sem resposta.</w:t>
       </w:r>
     </w:p>
     <w:p>
@@ -31,7 +31,7 @@
         <w:rPr>
           <w:color w:val="C00000"/>
         </w:rPr>
-        <w:t>Fique até o final, porque você vai descobrir o que aconteceu naquela festa de dois mil e dezessete. E como um caso com sete denúncias terminou, quase seis anos depois, num acordo de oito mil reais.</w:t>
+        <w:t>Fique até o final, porque você vai descobrir o que a Globo nunca explicou. E por que, depois de quase seis anos, ninguém consegue dizer quem estava falando a verdade.</w:t>
       </w:r>
     </w:p>
     <w:p>
@@ -39,7 +39,7 @@
         <w:rPr>
           <w:color w:val="000000"/>
         </w:rPr>
-        <w:t>Para entender como uma história desse tamanho ficou tanto tempo longe do público, é preciso entender primeiro o tamanho do poder que esse homem chegou a ter.</w:t>
+        <w:t>Para entender esse silêncio, é preciso voltar ao começo. Muito antes de Marcius Melhem ter o poder de decidir quem fazia o Brasil rir.</w:t>
       </w:r>
     </w:p>
     <w:p>
@@ -47,7 +47,7 @@
         <w:rPr>
           <w:color w:val="000000"/>
         </w:rPr>
-        <w:t>E esse poder começou longe dos estúdios.</w:t>
+        <w:t>Oito de fevereiro de mil novecentos e setenta e dois.</w:t>
       </w:r>
     </w:p>
     <w:p>
@@ -55,7 +55,7 @@
         <w:rPr>
           <w:color w:val="000000"/>
         </w:rPr>
-        <w:t>Marcius Vinícius de Assis Melhem nasceu no dia oito de fevereiro de mil novecentos e setenta e dois, em Nilópolis, na Baixada Fluminense.</w:t>
+        <w:t>Estado do Rio de Janeiro.</w:t>
       </w:r>
     </w:p>
     <w:p>
@@ -63,7 +63,7 @@
         <w:rPr>
           <w:color w:val="000000"/>
         </w:rPr>
-        <w:t>Nilópolis é uma cidade pequena, colada ao Rio de Janeiro, conhecida no país inteiro por uma coisa. A escola de samba Beija-Flor.</w:t>
+        <w:t>Nasce Marcius Vinícius de Assis Melhem.</w:t>
       </w:r>
     </w:p>
     <w:p>
@@ -71,7 +71,7 @@
         <w:rPr>
           <w:color w:val="000000"/>
         </w:rPr>
-        <w:t>Foi ali que o menino cresceu, longe da Zona Sul e longe da televisão.</w:t>
+        <w:t>As biografias divergem sobre a cidade. Algumas falam em Nilópolis, na Baixada Fluminense. Outras, em Niterói.</w:t>
       </w:r>
     </w:p>
     <w:p>
@@ -79,7 +79,7 @@
         <w:rPr>
           <w:color w:val="000000"/>
         </w:rPr>
-        <w:t>Ele foi estudar Jornalismo na PUC do Rio, uma das universidades mais tradicionais da cidade. Mas o que o puxava de verdade era o palco.</w:t>
+        <w:t>O que todas contam é que, no começo, o plano dele era outro.</w:t>
       </w:r>
     </w:p>
     <w:p>
@@ -87,7 +87,7 @@
         <w:rPr>
           <w:color w:val="000000"/>
         </w:rPr>
-        <w:t>Começou no teatro infantil. Em mil novecentos e noventa e dois, com vinte anos, ganhou um prêmio de ator revelação.</w:t>
+        <w:t>Marcius queria ser jornalista.</w:t>
       </w:r>
     </w:p>
     <w:p>
@@ -95,7 +95,7 @@
         <w:rPr>
           <w:color w:val="000000"/>
         </w:rPr>
-        <w:t>Era o primeiro sinal de que aquele rapaz da Baixada tinha talento para o palco.</w:t>
+        <w:t>Entrou na faculdade de jornalismo da PUC do Rio, uma das universidades mais respeitadas do país. E chegou a trabalhar na área, como diretor de jornalismo de uma agência que produzia notícias em tempo real para o mercado financeiro.</w:t>
       </w:r>
     </w:p>
     <w:p>
@@ -103,7 +103,15 @@
         <w:rPr>
           <w:color w:val="000000"/>
         </w:rPr>
-        <w:t>Nos anos seguintes, ele foi construindo o próprio caminho no humor carioca. Escrevia e atuava. A partir de dois mil e três, passou a escrever e apresentar o Salão Carioca de Humor.</w:t>
+        <w:t>Um caminho sério e seguro.</w:t>
+      </w:r>
+    </w:p>
+    <w:p>
+      <w:r>
+        <w:rPr>
+          <w:color w:val="C00000"/>
+        </w:rPr>
+        <w:t>Guarde essa imagem. Um jovem jornalista escrevendo notícias sobre o mercado financeiro. Porque, em poucos anos, esse mesmo homem ia estar no topo da maior fábrica de humor da televisão brasileira. E ia descobrir que, lá em cima, o poder também tem um preço.</w:t>
       </w:r>
     </w:p>
     <w:p>
@@ -111,7 +119,7 @@
         <w:rPr>
           <w:color w:val="000000"/>
         </w:rPr>
-        <w:t>Foi também no teatro que ele formou a parceria que mudaria a vida dele. Com um comediante chamado Leandro Hassum.</w:t>
+        <w:t>A virada aconteceu por acaso.</w:t>
       </w:r>
     </w:p>
     <w:p>
@@ -119,7 +127,63 @@
         <w:rPr>
           <w:color w:val="000000"/>
         </w:rPr>
-        <w:t>Os dois criaram juntos uma peça chamada Nós na Fita. Melhem e Hassum dividiam a direção e o palco.</w:t>
+        <w:t>Durante a faculdade, um amigo convidou Marcius para uma aula de teatro.</w:t>
+      </w:r>
+    </w:p>
+    <w:p>
+      <w:r>
+        <w:rPr>
+          <w:color w:val="000000"/>
+        </w:rPr>
+        <w:t>Ele foi.</w:t>
+      </w:r>
+    </w:p>
+    <w:p>
+      <w:r>
+        <w:rPr>
+          <w:color w:val="000000"/>
+        </w:rPr>
+        <w:t>E nunca mais saiu.</w:t>
+      </w:r>
+    </w:p>
+    <w:p>
+      <w:r>
+        <w:rPr>
+          <w:color w:val="000000"/>
+        </w:rPr>
+        <w:t>Descobriu no palco uma coisa que a redação de jornal não dava. A reação imediata da plateia. A risada que vem na hora, ou o silêncio que denuncia que a piada não funcionou.</w:t>
+      </w:r>
+    </w:p>
+    <w:p>
+      <w:r>
+        <w:rPr>
+          <w:color w:val="000000"/>
+        </w:rPr>
+        <w:t>Começou a atuar. Depois, a escrever. E foi nas duas funções juntas que ele encontrou o lugar dele.</w:t>
+      </w:r>
+    </w:p>
+    <w:p>
+      <w:r>
+        <w:rPr>
+          <w:color w:val="000000"/>
+        </w:rPr>
+        <w:t>O texto de humor exige uma precisão quase matemática. Uma palavra a mais e a piada morre. Uma pausa no lugar errado e ninguém ri. Melhem tinha esse talento. Sabia onde estava a graça.</w:t>
+      </w:r>
+    </w:p>
+    <w:p>
+      <w:r>
+        <w:rPr>
+          <w:color w:val="000000"/>
+        </w:rPr>
+        <w:t>No começo dos anos dois mil, chegou à TV Globo.</w:t>
+      </w:r>
+    </w:p>
+    <w:p>
+      <w:r>
+        <w:rPr>
+          <w:color w:val="000000"/>
+        </w:rPr>
+        <w:t>Ia ficar lá durante dezessete anos.</w:t>
       </w:r>
     </w:p>
     <w:p>
@@ -127,7 +191,7 @@
         <w:rPr>
           <w:color w:val="C00000"/>
         </w:rPr>
-        <w:t>Lembre desse nome, Leandro Hassum. Porque a dupla que nasceu no teatro ia levar Marcius Melhem para dentro da Globo. E, anos depois, para o lugar mais alto do humor da emissora.</w:t>
+        <w:t>Dezessete anos. Pense nesse número. Porque, ao longo desse tempo, aquele redator iniciante ia subir degrau por degrau até um cargo que quase ninguém no humor brasileiro chegou a ocupar. E foi justamente lá em cima que começaram as histórias que, anos depois, iam parar nas páginas de uma revista.</w:t>
       </w:r>
     </w:p>
     <w:p>
@@ -135,7 +199,7 @@
         <w:rPr>
           <w:color w:val="000000"/>
         </w:rPr>
-        <w:t>Em dois mil e cinco, Melhem entrou para o elenco fixo do Zorra Total, o humorístico das noites de sábado da Globo.</w:t>
+        <w:t>Um dos primeiros lugares onde o público começou a reconhecer Marcius Melhem foi o Zorra Total.</w:t>
       </w:r>
     </w:p>
     <w:p>
@@ -143,7 +207,7 @@
         <w:rPr>
           <w:color w:val="000000"/>
         </w:rPr>
-        <w:t>Lá, criou um personagem que o país inteiro ia conhecer. O Pedrão.</w:t>
+        <w:t>O programa de humor das noites de sábado era uma das maiores audiências da Globo. Um desfile de personagens e bordões.</w:t>
       </w:r>
     </w:p>
     <w:p>
@@ -151,7 +215,7 @@
         <w:rPr>
           <w:color w:val="000000"/>
         </w:rPr>
-        <w:t>No ano seguinte, ele e Hassum ganharam um especial próprio na emissora. Os Caras de Pau.</w:t>
+        <w:t>Lá, Melhem encontrou um parceiro que ia mudar a carreira dele.</w:t>
       </w:r>
     </w:p>
     <w:p>
@@ -159,7 +223,7 @@
         <w:rPr>
           <w:color w:val="000000"/>
         </w:rPr>
-        <w:t>Melhem era o Pedrão. Hassum era o Jorginho. Dois amigos atrapalhados que se metiam em confusões absurdas.</w:t>
+        <w:t>O humorista Leandro Hassum.</w:t>
       </w:r>
     </w:p>
     <w:p>
@@ -167,7 +231,7 @@
         <w:rPr>
           <w:color w:val="000000"/>
         </w:rPr>
-        <w:t>O especial deu tão certo que Os Caras de Pau virou programa fixo nas tardes de domingo.</w:t>
+        <w:t>Juntos, os dois criaram uma dupla de personagens que caiu no gosto do público. Pedrão e Jorginho.</w:t>
       </w:r>
     </w:p>
     <w:p>
@@ -175,7 +239,7 @@
         <w:rPr>
           <w:color w:val="000000"/>
         </w:rPr>
-        <w:t>Em dois mil e nove, Melhem ainda apareceu numa das novelas de maior audiência da década, Caminho das Índias, no papel de Radesh.</w:t>
+        <w:t>A química entre os dois era evidente.</w:t>
       </w:r>
     </w:p>
     <w:p>
@@ -183,7 +247,7 @@
         <w:rPr>
           <w:color w:val="000000"/>
         </w:rPr>
-        <w:t>O rapaz de Nilópolis estava em todo lugar.</w:t>
+        <w:t>O sucesso foi tão grande que, anos depois, a dupla ganhou um programa próprio.</w:t>
       </w:r>
     </w:p>
     <w:p>
@@ -191,7 +255,7 @@
         <w:rPr>
           <w:color w:val="000000"/>
         </w:rPr>
-        <w:t>Em dois mil e catorze, veio o projeto que deu a ele o respeito da crítica. Um programa chamado Tá no Ar, a TV na TV, criado e estrelado ao lado de Marcelo Adnet.</w:t>
+        <w:t>Chamava-se Os Caras de Pau.</w:t>
       </w:r>
     </w:p>
     <w:p>
@@ -199,7 +263,7 @@
         <w:rPr>
           <w:color w:val="000000"/>
         </w:rPr>
-        <w:t>Era um humor diferente, rápido, que ria da própria televisão. O programa ganhou elogios da crítica e ficou anos no ar.</w:t>
+        <w:t>Além de atuar, Melhem assinava o roteiro e participava da direção do programa.</w:t>
       </w:r>
     </w:p>
     <w:p>
@@ -207,7 +271,15 @@
         <w:rPr>
           <w:color w:val="000000"/>
         </w:rPr>
-        <w:t>Repare onde Melhem estava agora. Ator e criador de programas, ele era um dos homens que mais escreviam humor dentro da Globo.</w:t>
+        <w:t>Era o primeiro sinal de uma coisa que ia marcar a carreira dele dali em diante.</w:t>
+      </w:r>
+    </w:p>
+    <w:p>
+      <w:r>
+        <w:rPr>
+          <w:color w:val="000000"/>
+        </w:rPr>
+        <w:t>Além de fazer rir, ele queria comandar quem fazia rir.</w:t>
       </w:r>
     </w:p>
     <w:p>
@@ -215,127 +287,7 @@
         <w:rPr>
           <w:color w:val="C00000"/>
         </w:rPr>
-        <w:t>Mas o salto mais importante da carreira dele ainda estava por vir. Porque, em dois mil e dezoito, Marcius Melhem recebeu um cargo que colocou nas mãos dele o destino de dezenas de comediantes. E é aqui que essa história começa a mudar de tom.</w:t>
-      </w:r>
-    </w:p>
-    <w:p>
-      <w:r>
-        <w:rPr>
-          <w:color w:val="000000"/>
-        </w:rPr>
-        <w:t>Em dois mil e dezoito, Marcius Melhem se tornou o chefe do departamento de humor da TV Globo.</w:t>
-      </w:r>
-    </w:p>
-    <w:p>
-      <w:r>
-        <w:rPr>
-          <w:color w:val="000000"/>
-        </w:rPr>
-        <w:t>Pense no que isso significa.</w:t>
-      </w:r>
-    </w:p>
-    <w:p>
-      <w:r>
-        <w:rPr>
-          <w:color w:val="000000"/>
-        </w:rPr>
-        <w:t>Na maior emissora do país, todo humorista que quisesse um programa ou um personagem passava pela mesa dele.</w:t>
-      </w:r>
-    </w:p>
-    <w:p>
-      <w:r>
-        <w:rPr>
-          <w:color w:val="000000"/>
-        </w:rPr>
-        <w:t>Ele ajudava a decidir quem entrava no elenco. Quem ganhava espaço. Quem ia para o horário nobre e quem ficava esperando uma chance que talvez nunca viesse.</w:t>
-      </w:r>
-    </w:p>
-    <w:p>
-      <w:r>
-        <w:rPr>
-          <w:color w:val="000000"/>
-        </w:rPr>
-        <w:t>Imagine uma cadeira de diretor, numa sala dentro dos estúdios da Globo, no Rio de Janeiro.</w:t>
-      </w:r>
-    </w:p>
-    <w:p>
-      <w:r>
-        <w:rPr>
-          <w:color w:val="000000"/>
-        </w:rPr>
-        <w:t>Quem sentava naquela cadeira tinha nas mãos a carreira de muita gente.</w:t>
-      </w:r>
-    </w:p>
-    <w:p>
-      <w:r>
-        <w:rPr>
-          <w:color w:val="C00000"/>
-        </w:rPr>
-        <w:t>Guarde essa cadeira. Porque, segundo as denúncias que vieram depois, era justamente no meio das conversas sobre roteiro e elenco que algumas coisas começaram a acontecer. Coisas que, durante anos, ficaram guardadas entre quatro paredes.</w:t>
-      </w:r>
-    </w:p>
-    <w:p>
-      <w:r>
-        <w:rPr>
-          <w:color w:val="000000"/>
-        </w:rPr>
-        <w:t>Um dos programas mais importantes nas mãos dele era o Zorra.</w:t>
-      </w:r>
-    </w:p>
-    <w:p>
-      <w:r>
-        <w:rPr>
-          <w:color w:val="000000"/>
-        </w:rPr>
-        <w:t>O antigo Zorra Total tinha sido reformulado. Ganhou um texto mais moderno e um elenco mais jovem, e voltou a ser comentado nas noites de sábado.</w:t>
-      </w:r>
-    </w:p>
-    <w:p>
-      <w:r>
-        <w:rPr>
-          <w:color w:val="000000"/>
-        </w:rPr>
-        <w:t>Naquele elenco havia uma comediante que o Brasil já conhecia da televisão. Engraçada, rápida, com uma carreira em ascensão.</w:t>
-      </w:r>
-    </w:p>
-    <w:p>
-      <w:r>
-        <w:rPr>
-          <w:color w:val="000000"/>
-        </w:rPr>
-        <w:t>Dani Calabresa.</w:t>
-      </w:r>
-    </w:p>
-    <w:p>
-      <w:r>
-        <w:rPr>
-          <w:color w:val="000000"/>
-        </w:rPr>
-        <w:t>Para uma humorista, estar no Zorra significava estar no centro do humor da Globo. E estar no centro do humor da Globo significava trabalhar perto de Marcius Melhem.</w:t>
-      </w:r>
-    </w:p>
-    <w:p>
-      <w:r>
-        <w:rPr>
-          <w:color w:val="000000"/>
-        </w:rPr>
-        <w:t>Em dois mil e dezessete, o elenco do Zorra se reuniu numa festa de confraternização. Atores e gente da equipe. Uma noite para comemorar o trabalho do ano.</w:t>
-      </w:r>
-    </w:p>
-    <w:p>
-      <w:r>
-        <w:rPr>
-          <w:color w:val="000000"/>
-        </w:rPr>
-        <w:t>Ninguém ali imaginava que aquela festa ia virar, anos depois, o centro de um dos maiores escândalos da história da emissora.</w:t>
-      </w:r>
-    </w:p>
-    <w:p>
-      <w:r>
-        <w:rPr>
-          <w:color w:val="C00000"/>
-        </w:rPr>
-        <w:t>Porque o que aconteceu perto da porta de um banheiro, naquela noite, foi mantido longe do público durante mais de três anos. E, quando finalmente veio à tona, ninguém no humor brasileiro conseguiu olhar para Marcius Melhem do mesmo jeito.</w:t>
+        <w:t>E foi exatamente isso que ele conseguiu. Em poucos anos, Marcius Melhem ia se tornar o homem que decidia quais humoristas entravam no ar e quais ficavam de fora. Um poder enorme. E, segundo relatos que só viriam a público muito depois, um poder que algumas pessoas tinham medo de contrariar.</w:t>
       </w:r>
     </w:p>
     <w:sectPr>

</xml_diff>